<commit_message>
Include Markdown guides and presentation materials
</commit_message>
<xml_diff>
--- a/Documents/Documents/Report-SQLInjectionDetection.docx
+++ b/Documents/Documents/Report-SQLInjectionDetection.docx
@@ -626,6 +626,12 @@
           <w:sz w:val="33"/>
         </w:rPr>
       </w:pPr>
+      <w:r>
+        <w:rPr>
+          <w:sz w:val="33"/>
+        </w:rPr>
+        <w:t xml:space="preserve"> </w:t>
+      </w:r>
     </w:p>
     <w:p>
       <w:pPr>
@@ -20269,13 +20275,8 @@
                             <w:fldChar w:fldCharType="separate"/>
                           </w:r>
                           <w:r>
-                            <w:t>v</w:t>
+                            <w:t>vi</w:t>
                           </w:r>
-                          <w:proofErr w:type="spellStart"/>
-                          <w:r>
-                            <w:t>i</w:t>
-                          </w:r>
-                          <w:proofErr w:type="spellEnd"/>
                           <w:r>
                             <w:fldChar w:fldCharType="end"/>
                           </w:r>
@@ -20438,13 +20439,8 @@
                             <w:fldChar w:fldCharType="separate"/>
                           </w:r>
                           <w:r>
-                            <w:t>vii</w:t>
+                            <w:t>viii</w:t>
                           </w:r>
-                          <w:proofErr w:type="spellStart"/>
-                          <w:r>
-                            <w:t>i</w:t>
-                          </w:r>
-                          <w:proofErr w:type="spellEnd"/>
                           <w:r>
                             <w:fldChar w:fldCharType="end"/>
                           </w:r>

</xml_diff>